<commit_message>
nmv 11 08 2026
</commit_message>
<xml_diff>
--- a/TS Jatai Ghanam Project/TS 2.5/TS 2.5 Ghanam Sanskrit Corrections.docx
+++ b/TS Jatai Ghanam Project/TS 2.5/TS 2.5 Ghanam Sanskrit Corrections.docx
@@ -1,6 +1,6 @@
 
 <file path=word/document.xml><?xml version="1.0" encoding="utf-8"?>
-<w:document xmlns:wpc="http://schemas.microsoft.com/office/word/2010/wordprocessingCanvas" xmlns:cx="http://schemas.microsoft.com/office/drawing/2014/chartex" xmlns:cx1="http://schemas.microsoft.com/office/drawing/2015/9/8/chartex" xmlns:cx2="http://schemas.microsoft.com/office/drawing/2015/10/21/chartex" xmlns:cx3="http://schemas.microsoft.com/office/drawing/2016/5/9/chartex" xmlns:cx4="http://schemas.microsoft.com/office/drawing/2016/5/10/chartex" xmlns:cx5="http://schemas.microsoft.com/office/drawing/2016/5/11/chartex" xmlns:cx6="http://schemas.microsoft.com/office/drawing/2016/5/12/chartex" xmlns:cx7="http://schemas.microsoft.com/office/drawing/2016/5/13/chartex" xmlns:cx8="http://schemas.microsoft.com/office/drawing/2016/5/14/chartex" xmlns:mc="http://schemas.openxmlformats.org/markup-compatibility/2006" xmlns:aink="http://schemas.microsoft.com/office/drawing/2016/ink" xmlns:am3d="http://schemas.microsoft.com/office/drawing/2017/model3d" xmlns:o="urn:schemas-microsoft-com:office:office" xmlns:oel="http://schemas.microsoft.com/office/2019/extlst" xmlns:r="http://schemas.openxmlformats.org/officeDocument/2006/relationships" xmlns:m="http://schemas.openxmlformats.org/officeDocument/2006/math" xmlns:v="urn:schemas-microsoft-com:vml" xmlns:wp14="http://schemas.microsoft.com/office/word/2010/wordprocessingDrawing" xmlns:wp="http://schemas.openxmlformats.org/drawingml/2006/wordprocessingDrawing" xmlns:w10="urn:schemas-microsoft-com:office:word" xmlns:w="http://schemas.openxmlformats.org/wordprocessingml/2006/main" xmlns:w14="http://schemas.microsoft.com/office/word/2010/wordml" xmlns:w15="http://schemas.microsoft.com/office/word/2012/wordml" xmlns:w16cex="http://schemas.microsoft.com/office/word/2018/wordml/cex" xmlns:w16cid="http://schemas.microsoft.com/office/word/2016/wordml/cid" xmlns:w16="http://schemas.microsoft.com/office/word/2018/wordml" xmlns:w16du="http://schemas.microsoft.com/office/word/2023/wordml/word16du" xmlns:w16sdtdh="http://schemas.microsoft.com/office/word/2020/wordml/sdtdatahash" xmlns:w16sdtfl="http://schemas.microsoft.com/office/word/2024/wordml/sdtformatlock" xmlns:w16se="http://schemas.microsoft.com/office/word/2015/wordml/symex" xmlns:wpg="http://schemas.microsoft.com/office/word/2010/wordprocessingGroup" xmlns:wpi="http://schemas.microsoft.com/office/word/2010/wordprocessingInk" xmlns:wne="http://schemas.microsoft.com/office/word/2006/wordml" xmlns:wps="http://schemas.microsoft.com/office/word/2010/wordprocessingShape" mc:Ignorable="w14 w15 w16se w16cid w16 w16cex w16sdtdh w16sdtfl w16du wp14">
+<w:document xmlns:wpc="http://schemas.microsoft.com/office/word/2010/wordprocessingCanvas" xmlns:cx="http://schemas.microsoft.com/office/drawing/2014/chartex" xmlns:cx1="http://schemas.microsoft.com/office/drawing/2015/9/8/chartex" xmlns:cx2="http://schemas.microsoft.com/office/drawing/2015/10/21/chartex" xmlns:cx3="http://schemas.microsoft.com/office/drawing/2016/5/9/chartex" xmlns:cx4="http://schemas.microsoft.com/office/drawing/2016/5/10/chartex" xmlns:cx5="http://schemas.microsoft.com/office/drawing/2016/5/11/chartex" xmlns:cx6="http://schemas.microsoft.com/office/drawing/2016/5/12/chartex" xmlns:cx7="http://schemas.microsoft.com/office/drawing/2016/5/13/chartex" xmlns:cx8="http://schemas.microsoft.com/office/drawing/2016/5/14/chartex" xmlns:mc="http://schemas.openxmlformats.org/markup-compatibility/2006" xmlns:aink="http://schemas.microsoft.com/office/drawing/2016/ink" xmlns:am3d="http://schemas.microsoft.com/office/drawing/2017/model3d" xmlns:o="urn:schemas-microsoft-com:office:office" xmlns:oel="http://schemas.microsoft.com/office/2019/extlst" xmlns:r="http://schemas.openxmlformats.org/officeDocument/2006/relationships" xmlns:m="http://schemas.openxmlformats.org/officeDocument/2006/math" xmlns:v="urn:schemas-microsoft-com:vml" xmlns:wp14="http://schemas.microsoft.com/office/word/2010/wordprocessingDrawing" xmlns:wp="http://schemas.openxmlformats.org/drawingml/2006/wordprocessingDrawing" xmlns:w10="urn:schemas-microsoft-com:office:word" xmlns:w="http://schemas.openxmlformats.org/wordprocessingml/2006/main" xmlns:w14="http://schemas.microsoft.com/office/word/2010/wordml" xmlns:w15="http://schemas.microsoft.com/office/word/2012/wordml" xmlns:w16cei="http://schemas.microsoft.com/office/word/2026/wordml/cei" xmlns:w16cex="http://schemas.microsoft.com/office/word/2018/wordml/cex" xmlns:w16cid="http://schemas.microsoft.com/office/word/2016/wordml/cid" xmlns:w16="http://schemas.microsoft.com/office/word/2018/wordml" xmlns:w16du="http://schemas.microsoft.com/office/word/2023/wordml/word16du" xmlns:w16sdtdh="http://schemas.microsoft.com/office/word/2020/wordml/sdtdatahash" xmlns:w16sdtfl="http://schemas.microsoft.com/office/word/2024/wordml/sdtformatlock" xmlns:w16se="http://schemas.microsoft.com/office/word/2015/wordml/symex" xmlns:wpg="http://schemas.microsoft.com/office/word/2010/wordprocessingGroup" xmlns:wpi="http://schemas.microsoft.com/office/word/2010/wordprocessingInk" xmlns:wne="http://schemas.microsoft.com/office/word/2006/wordml" xmlns:wps="http://schemas.microsoft.com/office/word/2010/wordprocessingShape" mc:Ignorable="w14 w15 w16se w16cid w16 w16cex w16sdtdh w16sdtfl w16du wp14">
   <w:body>
     <w:p>
       <w:pPr>
@@ -90,10 +90,9 @@
           <w:bCs/>
           <w:sz w:val="32"/>
           <w:szCs w:val="32"/>
-          <w:highlight w:val="red"/>
           <w:u w:val="single"/>
         </w:rPr>
-        <w:t>??????</w:t>
+        <w:t>31st July 2026</w:t>
       </w:r>
     </w:p>
     <w:p>
@@ -728,61 +727,6 @@
           </w:p>
         </w:tc>
       </w:tr>
-      <w:tr>
-        <w:trPr>
-          <w:trHeight w:val="1121"/>
-        </w:trPr>
-        <w:tc>
-          <w:tcPr>
-            <w:tcW w:w="7514" w:type="dxa"/>
-            <w:tcBorders>
-              <w:top w:val="single" w:sz="4" w:space="0" w:color="000000"/>
-              <w:left w:val="single" w:sz="4" w:space="0" w:color="000000"/>
-              <w:bottom w:val="single" w:sz="4" w:space="0" w:color="000000"/>
-              <w:right w:val="single" w:sz="4" w:space="0" w:color="000000"/>
-            </w:tcBorders>
-          </w:tcPr>
-          <w:p>
-            <w:pPr>
-              <w:widowControl w:val="0"/>
-              <w:autoSpaceDE w:val="0"/>
-              <w:autoSpaceDN w:val="0"/>
-              <w:adjustRightInd w:val="0"/>
-              <w:spacing w:before="0" w:line="240" w:lineRule="auto"/>
-              <w:rPr>
-                <w:rFonts w:cs="BRH Malayalam Extra"/>
-                <w:color w:val="000000"/>
-                <w:szCs w:val="40"/>
-              </w:rPr>
-            </w:pPr>
-          </w:p>
-        </w:tc>
-        <w:tc>
-          <w:tcPr>
-            <w:tcW w:w="7371" w:type="dxa"/>
-            <w:tcBorders>
-              <w:top w:val="single" w:sz="4" w:space="0" w:color="000000"/>
-              <w:left w:val="single" w:sz="4" w:space="0" w:color="000000"/>
-              <w:bottom w:val="single" w:sz="4" w:space="0" w:color="000000"/>
-              <w:right w:val="single" w:sz="4" w:space="0" w:color="000000"/>
-            </w:tcBorders>
-          </w:tcPr>
-          <w:p>
-            <w:pPr>
-              <w:widowControl w:val="0"/>
-              <w:autoSpaceDE w:val="0"/>
-              <w:autoSpaceDN w:val="0"/>
-              <w:adjustRightInd w:val="0"/>
-              <w:spacing w:before="0" w:line="240" w:lineRule="auto"/>
-              <w:rPr>
-                <w:rFonts w:cs="BRH Malayalam Extra"/>
-                <w:color w:val="000000"/>
-                <w:szCs w:val="40"/>
-              </w:rPr>
-            </w:pPr>
-          </w:p>
-        </w:tc>
-      </w:tr>
     </w:tbl>
     <w:p>
       <w:pPr>
@@ -796,6 +740,16 @@
           <w:u w:val="single"/>
         </w:rPr>
       </w:pPr>
+      <w:r>
+        <w:rPr>
+          <w:b/>
+          <w:bCs/>
+          <w:sz w:val="32"/>
+          <w:szCs w:val="32"/>
+          <w:u w:val="single"/>
+        </w:rPr>
+        <w:t>===========</w:t>
+      </w:r>
     </w:p>
     <w:p>
       <w:pPr>
@@ -2965,7 +2919,6 @@
                 <w:color w:val="000000"/>
                 <w:szCs w:val="40"/>
               </w:rPr>
-              <w:lastRenderedPageBreak/>
               <w:t>46</w:t>
             </w:r>
             <w:r>
@@ -3589,6 +3542,7 @@
                 <w:color w:val="000000"/>
                 <w:szCs w:val="40"/>
               </w:rPr>
+              <w:lastRenderedPageBreak/>
               <w:t>36</w:t>
             </w:r>
             <w:r>
@@ -3984,22 +3938,6 @@
               </w:rPr>
               <w:t xml:space="preserve">xÉqÉç | </w:t>
             </w:r>
-          </w:p>
-          <w:p>
-            <w:pPr>
-              <w:widowControl w:val="0"/>
-              <w:autoSpaceDE w:val="0"/>
-              <w:autoSpaceDN w:val="0"/>
-              <w:adjustRightInd w:val="0"/>
-              <w:spacing w:before="0" w:line="240" w:lineRule="auto"/>
-              <w:ind w:right="-234"/>
-              <w:rPr>
-                <w:rFonts w:ascii="BRH Devanagari Extra" w:hAnsi="BRH Devanagari Extra" w:cs="BRH Devanagari Extra"/>
-                <w:color w:val="000000"/>
-                <w:sz w:val="32"/>
-                <w:szCs w:val="40"/>
-              </w:rPr>
-            </w:pPr>
           </w:p>
           <w:p>
             <w:pPr>
@@ -4851,22 +4789,6 @@
               </w:rPr>
               <w:t xml:space="preserve">xÉqÉç | </w:t>
             </w:r>
-          </w:p>
-          <w:p>
-            <w:pPr>
-              <w:widowControl w:val="0"/>
-              <w:autoSpaceDE w:val="0"/>
-              <w:autoSpaceDN w:val="0"/>
-              <w:adjustRightInd w:val="0"/>
-              <w:spacing w:before="0" w:line="240" w:lineRule="auto"/>
-              <w:ind w:right="-93"/>
-              <w:rPr>
-                <w:rFonts w:ascii="BRH Devanagari Extra" w:hAnsi="BRH Devanagari Extra" w:cs="BRH Devanagari Extra"/>
-                <w:color w:val="000000"/>
-                <w:sz w:val="32"/>
-                <w:szCs w:val="40"/>
-              </w:rPr>
-            </w:pPr>
           </w:p>
           <w:p>
             <w:pPr>
@@ -6450,7 +6372,6 @@
                 <w:szCs w:val="40"/>
                 <w:highlight w:val="yellow"/>
               </w:rPr>
-              <w:lastRenderedPageBreak/>
               <w:t>r</w:t>
             </w:r>
             <w:r>
@@ -6821,7 +6742,17 @@
                 <w:sz w:val="32"/>
                 <w:szCs w:val="40"/>
               </w:rPr>
-              <w:t xml:space="preserve"> µÉÈ</w:t>
+              <w:t xml:space="preserve"> </w:t>
+            </w:r>
+            <w:r>
+              <w:rPr>
+                <w:rFonts w:ascii="BRH Devanagari Extra" w:hAnsi="BRH Devanagari Extra" w:cs="BRH Devanagari Extra"/>
+                <w:color w:val="000000"/>
+                <w:sz w:val="32"/>
+                <w:szCs w:val="40"/>
+              </w:rPr>
+              <w:lastRenderedPageBreak/>
+              <w:t>µÉÈ</w:t>
             </w:r>
             <w:r>
               <w:rPr>
@@ -8185,7 +8116,6 @@
                 <w:szCs w:val="40"/>
                 <w:highlight w:val="green"/>
               </w:rPr>
-              <w:lastRenderedPageBreak/>
               <w:t>rÉ</w:t>
             </w:r>
             <w:r>
@@ -8564,7 +8494,17 @@
                 <w:sz w:val="32"/>
                 <w:szCs w:val="40"/>
               </w:rPr>
-              <w:t xml:space="preserve"> µÉÈ</w:t>
+              <w:t xml:space="preserve"> </w:t>
+            </w:r>
+            <w:r>
+              <w:rPr>
+                <w:rFonts w:ascii="BRH Devanagari Extra" w:hAnsi="BRH Devanagari Extra" w:cs="BRH Devanagari Extra"/>
+                <w:color w:val="000000"/>
+                <w:sz w:val="32"/>
+                <w:szCs w:val="40"/>
+              </w:rPr>
+              <w:lastRenderedPageBreak/>
+              <w:t>µÉÈ</w:t>
             </w:r>
             <w:r>
               <w:rPr>
@@ -10628,7 +10568,6 @@
                 <w:sz w:val="32"/>
                 <w:szCs w:val="40"/>
               </w:rPr>
-              <w:lastRenderedPageBreak/>
               <w:t>xÉÉ</w:t>
             </w:r>
             <w:r>
@@ -11111,6 +11050,7 @@
                 <w:color w:val="000000"/>
                 <w:szCs w:val="40"/>
               </w:rPr>
+              <w:lastRenderedPageBreak/>
               <w:t>18</w:t>
             </w:r>
             <w:r>
@@ -13112,7 +13052,6 @@
                 <w:sz w:val="32"/>
                 <w:szCs w:val="40"/>
               </w:rPr>
-              <w:lastRenderedPageBreak/>
               <w:t>xÉÉ</w:t>
             </w:r>
             <w:r>
@@ -13548,6 +13487,7 @@
                 <w:color w:val="000000"/>
                 <w:szCs w:val="40"/>
               </w:rPr>
+              <w:lastRenderedPageBreak/>
               <w:t>18</w:t>
             </w:r>
             <w:r>
@@ -15677,7 +15617,6 @@
                 <w:color w:val="000000"/>
                 <w:szCs w:val="40"/>
               </w:rPr>
-              <w:lastRenderedPageBreak/>
               <w:t>61</w:t>
             </w:r>
             <w:r>
@@ -16006,7 +15945,6 @@
                 <w:color w:val="000000"/>
                 <w:szCs w:val="40"/>
               </w:rPr>
-              <w:lastRenderedPageBreak/>
               <w:t>57</w:t>
             </w:r>
             <w:r>
@@ -17694,7 +17632,6 @@
                 <w:color w:val="000000"/>
                 <w:szCs w:val="40"/>
               </w:rPr>
-              <w:lastRenderedPageBreak/>
               <w:t>61</w:t>
             </w:r>
             <w:r>
@@ -19489,17 +19426,7 @@
                 <w:sz w:val="32"/>
                 <w:szCs w:val="40"/>
               </w:rPr>
-              <w:t xml:space="preserve">Uç uÉæ uÉÉ </w:t>
-            </w:r>
-            <w:r>
-              <w:rPr>
-                <w:rFonts w:ascii="BRH Devanagari Extra" w:hAnsi="BRH Devanagari Extra" w:cs="BRH Devanagari Extra"/>
-                <w:color w:val="000000"/>
-                <w:sz w:val="32"/>
-                <w:szCs w:val="40"/>
-              </w:rPr>
-              <w:lastRenderedPageBreak/>
-              <w:t>G</w:t>
+              <w:t>Uç uÉæ uÉÉ G</w:t>
             </w:r>
             <w:r>
               <w:rPr>
@@ -20082,7 +20009,6 @@
                 <w:color w:val="000000"/>
                 <w:szCs w:val="40"/>
               </w:rPr>
-              <w:lastRenderedPageBreak/>
               <w:t>35</w:t>
             </w:r>
             <w:r>
@@ -20862,17 +20788,7 @@
                 <w:sz w:val="32"/>
                 <w:szCs w:val="40"/>
               </w:rPr>
-              <w:t xml:space="preserve">Uç uÉæ uÉÉ </w:t>
-            </w:r>
-            <w:r>
-              <w:rPr>
-                <w:rFonts w:ascii="BRH Devanagari Extra" w:hAnsi="BRH Devanagari Extra" w:cs="BRH Devanagari Extra"/>
-                <w:color w:val="000000"/>
-                <w:sz w:val="32"/>
-                <w:szCs w:val="40"/>
-              </w:rPr>
-              <w:lastRenderedPageBreak/>
-              <w:t>G</w:t>
+              <w:t>Uç uÉæ uÉÉ G</w:t>
             </w:r>
             <w:r>
               <w:rPr>
@@ -21472,7 +21388,6 @@
                 <w:color w:val="000000"/>
                 <w:szCs w:val="40"/>
               </w:rPr>
-              <w:lastRenderedPageBreak/>
               <w:t>32</w:t>
             </w:r>
             <w:r>
@@ -22309,6 +22224,7 @@
                 <w:color w:val="000000"/>
                 <w:szCs w:val="40"/>
               </w:rPr>
+              <w:lastRenderedPageBreak/>
               <w:t>25</w:t>
             </w:r>
             <w:r>
@@ -23889,7 +23805,6 @@
                 <w:szCs w:val="40"/>
                 <w:highlight w:val="yellow"/>
               </w:rPr>
-              <w:lastRenderedPageBreak/>
               <w:t>bÉ×</w:t>
             </w:r>
             <w:r>
@@ -24325,7 +24240,6 @@
                 <w:szCs w:val="40"/>
                 <w:lang w:val="it-IT"/>
               </w:rPr>
-              <w:lastRenderedPageBreak/>
               <w:t>25</w:t>
             </w:r>
             <w:r>
@@ -25917,7 +25831,6 @@
                 <w:highlight w:val="green"/>
                 <w:lang w:val="it-IT"/>
               </w:rPr>
-              <w:lastRenderedPageBreak/>
               <w:t>bÉ×</w:t>
             </w:r>
             <w:r>
@@ -27313,9 +27226,8 @@
               <w:adjustRightInd w:val="0"/>
               <w:spacing w:before="0" w:line="240" w:lineRule="auto"/>
               <w:rPr>
-                <w:rFonts w:ascii="BRH Devanagari Extra" w:hAnsi="BRH Devanagari Extra" w:cs="BRH Devanagari Extra"/>
-                <w:color w:val="000000"/>
-                <w:sz w:val="32"/>
+                <w:rFonts w:cs="BRH Malayalam Extra"/>
+                <w:color w:val="000000"/>
                 <w:szCs w:val="40"/>
                 <w:lang w:val="it-IT"/>
               </w:rPr>
@@ -27486,21 +27398,6 @@
               </w:rPr>
               <w:t xml:space="preserve">Í¥ÉrÉÉlÉçþ | </w:t>
             </w:r>
-          </w:p>
-          <w:p>
-            <w:pPr>
-              <w:widowControl w:val="0"/>
-              <w:autoSpaceDE w:val="0"/>
-              <w:autoSpaceDN w:val="0"/>
-              <w:adjustRightInd w:val="0"/>
-              <w:spacing w:before="0" w:line="240" w:lineRule="auto"/>
-              <w:rPr>
-                <w:rFonts w:cs="BRH Malayalam Extra"/>
-                <w:color w:val="000000"/>
-                <w:szCs w:val="40"/>
-                <w:lang w:val="it-IT"/>
-              </w:rPr>
-            </w:pPr>
           </w:p>
         </w:tc>
         <w:tc>
@@ -28383,9 +28280,8 @@
               <w:adjustRightInd w:val="0"/>
               <w:spacing w:before="0" w:line="240" w:lineRule="auto"/>
               <w:rPr>
-                <w:rFonts w:ascii="BRH Devanagari Extra" w:hAnsi="BRH Devanagari Extra" w:cs="BRH Devanagari Extra"/>
-                <w:color w:val="000000"/>
-                <w:sz w:val="32"/>
+                <w:rFonts w:cs="BRH Malayalam Extra"/>
+                <w:color w:val="000000"/>
                 <w:szCs w:val="40"/>
                 <w:lang w:val="it-IT"/>
               </w:rPr>
@@ -28526,21 +28422,6 @@
               </w:rPr>
               <w:t xml:space="preserve">Í¥ÉrÉÉlÉçþ | </w:t>
             </w:r>
-          </w:p>
-          <w:p>
-            <w:pPr>
-              <w:widowControl w:val="0"/>
-              <w:autoSpaceDE w:val="0"/>
-              <w:autoSpaceDN w:val="0"/>
-              <w:adjustRightInd w:val="0"/>
-              <w:spacing w:before="0" w:line="240" w:lineRule="auto"/>
-              <w:rPr>
-                <w:rFonts w:cs="BRH Malayalam Extra"/>
-                <w:color w:val="000000"/>
-                <w:szCs w:val="40"/>
-                <w:lang w:val="it-IT"/>
-              </w:rPr>
-            </w:pPr>
           </w:p>
         </w:tc>
       </w:tr>
@@ -28580,7 +28461,6 @@
                 <w:szCs w:val="40"/>
                 <w:lang w:val="it-IT"/>
               </w:rPr>
-              <w:lastRenderedPageBreak/>
               <w:t>46</w:t>
             </w:r>
             <w:r>
@@ -29521,6 +29401,7 @@
                 <w:szCs w:val="40"/>
                 <w:lang w:val="it-IT"/>
               </w:rPr>
+              <w:lastRenderedPageBreak/>
               <w:t>48</w:t>
             </w:r>
             <w:r>
@@ -29995,6 +29876,7 @@
                 <w:szCs w:val="40"/>
                 <w:lang w:val="it-IT"/>
               </w:rPr>
+              <w:lastRenderedPageBreak/>
               <w:t>46</w:t>
             </w:r>
             <w:r>
@@ -30895,6 +30777,7 @@
                 <w:szCs w:val="40"/>
                 <w:lang w:val="it-IT"/>
               </w:rPr>
+              <w:lastRenderedPageBreak/>
               <w:t>48</w:t>
             </w:r>
             <w:r>
@@ -31319,7 +31202,7 @@
       </w:tr>
       <w:tr>
         <w:trPr>
-          <w:trHeight w:val="1651"/>
+          <w:trHeight w:val="1975"/>
         </w:trPr>
         <w:tc>
           <w:tcPr>
@@ -31353,6 +31236,7 @@
                 <w:szCs w:val="40"/>
                 <w:lang w:val="it-IT"/>
               </w:rPr>
+              <w:lastRenderedPageBreak/>
               <w:t>54</w:t>
             </w:r>
             <w:r>
@@ -31773,7 +31657,6 @@
                 <w:szCs w:val="40"/>
                 <w:lang w:val="it-IT"/>
               </w:rPr>
-              <w:lastRenderedPageBreak/>
               <w:t>55</w:t>
             </w:r>
             <w:r>
@@ -32547,7 +32430,18 @@
                 <w:szCs w:val="40"/>
                 <w:lang w:val="it-IT"/>
               </w:rPr>
-              <w:t xml:space="preserve">xrÉÉ uÉþÂSèkrÉæ | </w:t>
+              <w:t xml:space="preserve">xrÉÉ </w:t>
+            </w:r>
+            <w:r>
+              <w:rPr>
+                <w:rFonts w:ascii="BRH Devanagari Extra" w:hAnsi="BRH Devanagari Extra" w:cs="BRH Devanagari Extra"/>
+                <w:color w:val="000000"/>
+                <w:sz w:val="32"/>
+                <w:szCs w:val="40"/>
+                <w:lang w:val="it-IT"/>
+              </w:rPr>
+              <w:lastRenderedPageBreak/>
+              <w:t xml:space="preserve">uÉþÂSèkrÉæ | </w:t>
             </w:r>
           </w:p>
           <w:p>
@@ -33248,7 +33142,6 @@
                 <w:szCs w:val="40"/>
                 <w:lang w:val="it-IT"/>
               </w:rPr>
-              <w:lastRenderedPageBreak/>
               <w:t>55</w:t>
             </w:r>
             <w:r>
@@ -33996,7 +33889,18 @@
                 <w:szCs w:val="40"/>
                 <w:lang w:val="it-IT"/>
               </w:rPr>
-              <w:t xml:space="preserve">xrÉÉ uÉþÂSèkrÉæ | </w:t>
+              <w:t xml:space="preserve">xrÉÉ </w:t>
+            </w:r>
+            <w:r>
+              <w:rPr>
+                <w:rFonts w:ascii="BRH Devanagari Extra" w:hAnsi="BRH Devanagari Extra" w:cs="BRH Devanagari Extra"/>
+                <w:color w:val="000000"/>
+                <w:sz w:val="32"/>
+                <w:szCs w:val="40"/>
+                <w:lang w:val="it-IT"/>
+              </w:rPr>
+              <w:lastRenderedPageBreak/>
+              <w:t xml:space="preserve">uÉþÂSèkrÉæ | </w:t>
             </w:r>
           </w:p>
           <w:p>
@@ -35410,7 +35314,6 @@
                 <w:szCs w:val="40"/>
                 <w:lang w:val="it-IT"/>
               </w:rPr>
-              <w:lastRenderedPageBreak/>
               <w:t>27</w:t>
             </w:r>
             <w:r>
@@ -36052,7 +35955,6 @@
                 <w:szCs w:val="40"/>
                 <w:lang w:val="it-IT"/>
               </w:rPr>
-              <w:lastRenderedPageBreak/>
               <w:t>24</w:t>
             </w:r>
             <w:r>
@@ -37039,7 +36941,6 @@
                 <w:szCs w:val="40"/>
                 <w:lang w:val="it-IT"/>
               </w:rPr>
-              <w:lastRenderedPageBreak/>
               <w:t>27</w:t>
             </w:r>
             <w:r>
@@ -40770,7 +40671,6 @@
                 <w:szCs w:val="40"/>
                 <w:lang w:val="it-IT"/>
               </w:rPr>
-              <w:lastRenderedPageBreak/>
               <w:t>35</w:t>
             </w:r>
             <w:r>
@@ -41989,6 +41889,7 @@
           <w:szCs w:val="32"/>
           <w:u w:val="single"/>
         </w:rPr>
+        <w:lastRenderedPageBreak/>
         <w:t xml:space="preserve">TS </w:t>
       </w:r>
       <w:r>
@@ -42374,7 +42275,7 @@
 </file>
 
 <file path=word/endnotes.xml><?xml version="1.0" encoding="utf-8"?>
-<w:endnotes xmlns:wpc="http://schemas.microsoft.com/office/word/2010/wordprocessingCanvas" xmlns:cx="http://schemas.microsoft.com/office/drawing/2014/chartex" xmlns:cx1="http://schemas.microsoft.com/office/drawing/2015/9/8/chartex" xmlns:cx2="http://schemas.microsoft.com/office/drawing/2015/10/21/chartex" xmlns:cx3="http://schemas.microsoft.com/office/drawing/2016/5/9/chartex" xmlns:cx4="http://schemas.microsoft.com/office/drawing/2016/5/10/chartex" xmlns:cx5="http://schemas.microsoft.com/office/drawing/2016/5/11/chartex" xmlns:cx6="http://schemas.microsoft.com/office/drawing/2016/5/12/chartex" xmlns:cx7="http://schemas.microsoft.com/office/drawing/2016/5/13/chartex" xmlns:cx8="http://schemas.microsoft.com/office/drawing/2016/5/14/chartex" xmlns:mc="http://schemas.openxmlformats.org/markup-compatibility/2006" xmlns:aink="http://schemas.microsoft.com/office/drawing/2016/ink" xmlns:am3d="http://schemas.microsoft.com/office/drawing/2017/model3d" xmlns:o="urn:schemas-microsoft-com:office:office" xmlns:oel="http://schemas.microsoft.com/office/2019/extlst" xmlns:r="http://schemas.openxmlformats.org/officeDocument/2006/relationships" xmlns:m="http://schemas.openxmlformats.org/officeDocument/2006/math" xmlns:v="urn:schemas-microsoft-com:vml" xmlns:wp14="http://schemas.microsoft.com/office/word/2010/wordprocessingDrawing" xmlns:wp="http://schemas.openxmlformats.org/drawingml/2006/wordprocessingDrawing" xmlns:w10="urn:schemas-microsoft-com:office:word" xmlns:w="http://schemas.openxmlformats.org/wordprocessingml/2006/main" xmlns:w14="http://schemas.microsoft.com/office/word/2010/wordml" xmlns:w15="http://schemas.microsoft.com/office/word/2012/wordml" xmlns:w16cex="http://schemas.microsoft.com/office/word/2018/wordml/cex" xmlns:w16cid="http://schemas.microsoft.com/office/word/2016/wordml/cid" xmlns:w16="http://schemas.microsoft.com/office/word/2018/wordml" xmlns:w16du="http://schemas.microsoft.com/office/word/2023/wordml/word16du" xmlns:w16sdtdh="http://schemas.microsoft.com/office/word/2020/wordml/sdtdatahash" xmlns:w16sdtfl="http://schemas.microsoft.com/office/word/2024/wordml/sdtformatlock" xmlns:w16se="http://schemas.microsoft.com/office/word/2015/wordml/symex" xmlns:wpg="http://schemas.microsoft.com/office/word/2010/wordprocessingGroup" xmlns:wpi="http://schemas.microsoft.com/office/word/2010/wordprocessingInk" xmlns:wne="http://schemas.microsoft.com/office/word/2006/wordml" xmlns:wps="http://schemas.microsoft.com/office/word/2010/wordprocessingShape" mc:Ignorable="w14 w15 w16se w16cid w16 w16cex w16sdtdh w16sdtfl w16du wp14">
+<w:endnotes xmlns:wpc="http://schemas.microsoft.com/office/word/2010/wordprocessingCanvas" xmlns:cx="http://schemas.microsoft.com/office/drawing/2014/chartex" xmlns:cx1="http://schemas.microsoft.com/office/drawing/2015/9/8/chartex" xmlns:cx2="http://schemas.microsoft.com/office/drawing/2015/10/21/chartex" xmlns:cx3="http://schemas.microsoft.com/office/drawing/2016/5/9/chartex" xmlns:cx4="http://schemas.microsoft.com/office/drawing/2016/5/10/chartex" xmlns:cx5="http://schemas.microsoft.com/office/drawing/2016/5/11/chartex" xmlns:cx6="http://schemas.microsoft.com/office/drawing/2016/5/12/chartex" xmlns:cx7="http://schemas.microsoft.com/office/drawing/2016/5/13/chartex" xmlns:cx8="http://schemas.microsoft.com/office/drawing/2016/5/14/chartex" xmlns:mc="http://schemas.openxmlformats.org/markup-compatibility/2006" xmlns:aink="http://schemas.microsoft.com/office/drawing/2016/ink" xmlns:am3d="http://schemas.microsoft.com/office/drawing/2017/model3d" xmlns:o="urn:schemas-microsoft-com:office:office" xmlns:oel="http://schemas.microsoft.com/office/2019/extlst" xmlns:r="http://schemas.openxmlformats.org/officeDocument/2006/relationships" xmlns:m="http://schemas.openxmlformats.org/officeDocument/2006/math" xmlns:v="urn:schemas-microsoft-com:vml" xmlns:wp14="http://schemas.microsoft.com/office/word/2010/wordprocessingDrawing" xmlns:wp="http://schemas.openxmlformats.org/drawingml/2006/wordprocessingDrawing" xmlns:w10="urn:schemas-microsoft-com:office:word" xmlns:w="http://schemas.openxmlformats.org/wordprocessingml/2006/main" xmlns:w14="http://schemas.microsoft.com/office/word/2010/wordml" xmlns:w15="http://schemas.microsoft.com/office/word/2012/wordml" xmlns:w16cei="http://schemas.microsoft.com/office/word/2026/wordml/cei" xmlns:w16cex="http://schemas.microsoft.com/office/word/2018/wordml/cex" xmlns:w16cid="http://schemas.microsoft.com/office/word/2016/wordml/cid" xmlns:w16="http://schemas.microsoft.com/office/word/2018/wordml" xmlns:w16du="http://schemas.microsoft.com/office/word/2023/wordml/word16du" xmlns:w16sdtdh="http://schemas.microsoft.com/office/word/2020/wordml/sdtdatahash" xmlns:w16sdtfl="http://schemas.microsoft.com/office/word/2024/wordml/sdtformatlock" xmlns:w16se="http://schemas.microsoft.com/office/word/2015/wordml/symex" xmlns:wpg="http://schemas.microsoft.com/office/word/2010/wordprocessingGroup" xmlns:wpi="http://schemas.microsoft.com/office/word/2010/wordprocessingInk" xmlns:wne="http://schemas.microsoft.com/office/word/2006/wordml" xmlns:wps="http://schemas.microsoft.com/office/word/2010/wordprocessingShape" mc:Ignorable="w14 w15 w16se w16cid w16 w16cex w16sdtdh w16sdtfl w16du wp14">
   <w:endnote w:type="separator" w:id="-1">
     <w:p>
       <w:pPr>
@@ -42399,7 +42300,7 @@
 </file>
 
 <file path=word/footer1.xml><?xml version="1.0" encoding="utf-8"?>
-<w:ftr xmlns:wpc="http://schemas.microsoft.com/office/word/2010/wordprocessingCanvas" xmlns:cx="http://schemas.microsoft.com/office/drawing/2014/chartex" xmlns:cx1="http://schemas.microsoft.com/office/drawing/2015/9/8/chartex" xmlns:cx2="http://schemas.microsoft.com/office/drawing/2015/10/21/chartex" xmlns:cx3="http://schemas.microsoft.com/office/drawing/2016/5/9/chartex" xmlns:cx4="http://schemas.microsoft.com/office/drawing/2016/5/10/chartex" xmlns:cx5="http://schemas.microsoft.com/office/drawing/2016/5/11/chartex" xmlns:cx6="http://schemas.microsoft.com/office/drawing/2016/5/12/chartex" xmlns:cx7="http://schemas.microsoft.com/office/drawing/2016/5/13/chartex" xmlns:cx8="http://schemas.microsoft.com/office/drawing/2016/5/14/chartex" xmlns:mc="http://schemas.openxmlformats.org/markup-compatibility/2006" xmlns:aink="http://schemas.microsoft.com/office/drawing/2016/ink" xmlns:am3d="http://schemas.microsoft.com/office/drawing/2017/model3d" xmlns:o="urn:schemas-microsoft-com:office:office" xmlns:oel="http://schemas.microsoft.com/office/2019/extlst" xmlns:r="http://schemas.openxmlformats.org/officeDocument/2006/relationships" xmlns:m="http://schemas.openxmlformats.org/officeDocument/2006/math" xmlns:v="urn:schemas-microsoft-com:vml" xmlns:wp14="http://schemas.microsoft.com/office/word/2010/wordprocessingDrawing" xmlns:wp="http://schemas.openxmlformats.org/drawingml/2006/wordprocessingDrawing" xmlns:w10="urn:schemas-microsoft-com:office:word" xmlns:w="http://schemas.openxmlformats.org/wordprocessingml/2006/main" xmlns:w14="http://schemas.microsoft.com/office/word/2010/wordml" xmlns:w15="http://schemas.microsoft.com/office/word/2012/wordml" xmlns:w16cex="http://schemas.microsoft.com/office/word/2018/wordml/cex" xmlns:w16cid="http://schemas.microsoft.com/office/word/2016/wordml/cid" xmlns:w16="http://schemas.microsoft.com/office/word/2018/wordml" xmlns:w16du="http://schemas.microsoft.com/office/word/2023/wordml/word16du" xmlns:w16sdtdh="http://schemas.microsoft.com/office/word/2020/wordml/sdtdatahash" xmlns:w16sdtfl="http://schemas.microsoft.com/office/word/2024/wordml/sdtformatlock" xmlns:w16se="http://schemas.microsoft.com/office/word/2015/wordml/symex" xmlns:wpg="http://schemas.microsoft.com/office/word/2010/wordprocessingGroup" xmlns:wpi="http://schemas.microsoft.com/office/word/2010/wordprocessingInk" xmlns:wne="http://schemas.microsoft.com/office/word/2006/wordml" xmlns:wps="http://schemas.microsoft.com/office/word/2010/wordprocessingShape" mc:Ignorable="w14 w15 w16se w16cid w16 w16cex w16sdtdh w16sdtfl w16du wp14">
+<w:ftr xmlns:wpc="http://schemas.microsoft.com/office/word/2010/wordprocessingCanvas" xmlns:cx="http://schemas.microsoft.com/office/drawing/2014/chartex" xmlns:cx1="http://schemas.microsoft.com/office/drawing/2015/9/8/chartex" xmlns:cx2="http://schemas.microsoft.com/office/drawing/2015/10/21/chartex" xmlns:cx3="http://schemas.microsoft.com/office/drawing/2016/5/9/chartex" xmlns:cx4="http://schemas.microsoft.com/office/drawing/2016/5/10/chartex" xmlns:cx5="http://schemas.microsoft.com/office/drawing/2016/5/11/chartex" xmlns:cx6="http://schemas.microsoft.com/office/drawing/2016/5/12/chartex" xmlns:cx7="http://schemas.microsoft.com/office/drawing/2016/5/13/chartex" xmlns:cx8="http://schemas.microsoft.com/office/drawing/2016/5/14/chartex" xmlns:mc="http://schemas.openxmlformats.org/markup-compatibility/2006" xmlns:aink="http://schemas.microsoft.com/office/drawing/2016/ink" xmlns:am3d="http://schemas.microsoft.com/office/drawing/2017/model3d" xmlns:o="urn:schemas-microsoft-com:office:office" xmlns:oel="http://schemas.microsoft.com/office/2019/extlst" xmlns:r="http://schemas.openxmlformats.org/officeDocument/2006/relationships" xmlns:m="http://schemas.openxmlformats.org/officeDocument/2006/math" xmlns:v="urn:schemas-microsoft-com:vml" xmlns:wp14="http://schemas.microsoft.com/office/word/2010/wordprocessingDrawing" xmlns:wp="http://schemas.openxmlformats.org/drawingml/2006/wordprocessingDrawing" xmlns:w10="urn:schemas-microsoft-com:office:word" xmlns:w="http://schemas.openxmlformats.org/wordprocessingml/2006/main" xmlns:w14="http://schemas.microsoft.com/office/word/2010/wordml" xmlns:w15="http://schemas.microsoft.com/office/word/2012/wordml" xmlns:w16cei="http://schemas.microsoft.com/office/word/2026/wordml/cei" xmlns:w16cex="http://schemas.microsoft.com/office/word/2018/wordml/cex" xmlns:w16cid="http://schemas.microsoft.com/office/word/2016/wordml/cid" xmlns:w16="http://schemas.microsoft.com/office/word/2018/wordml" xmlns:w16du="http://schemas.microsoft.com/office/word/2023/wordml/word16du" xmlns:w16sdtdh="http://schemas.microsoft.com/office/word/2020/wordml/sdtdatahash" xmlns:w16sdtfl="http://schemas.microsoft.com/office/word/2024/wordml/sdtformatlock" xmlns:w16se="http://schemas.microsoft.com/office/word/2015/wordml/symex" xmlns:wpg="http://schemas.microsoft.com/office/word/2010/wordprocessingGroup" xmlns:wpi="http://schemas.microsoft.com/office/word/2010/wordprocessingInk" xmlns:wne="http://schemas.microsoft.com/office/word/2006/wordml" xmlns:wps="http://schemas.microsoft.com/office/word/2010/wordprocessingShape" mc:Ignorable="w14 w15 w16se w16cid w16 w16cex w16sdtdh w16sdtfl w16du wp14">
   <w:p>
     <w:pPr>
       <w:pBdr>
@@ -42581,7 +42482,7 @@
 </file>
 
 <file path=word/footer2.xml><?xml version="1.0" encoding="utf-8"?>
-<w:ftr xmlns:wpc="http://schemas.microsoft.com/office/word/2010/wordprocessingCanvas" xmlns:cx="http://schemas.microsoft.com/office/drawing/2014/chartex" xmlns:cx1="http://schemas.microsoft.com/office/drawing/2015/9/8/chartex" xmlns:cx2="http://schemas.microsoft.com/office/drawing/2015/10/21/chartex" xmlns:cx3="http://schemas.microsoft.com/office/drawing/2016/5/9/chartex" xmlns:cx4="http://schemas.microsoft.com/office/drawing/2016/5/10/chartex" xmlns:cx5="http://schemas.microsoft.com/office/drawing/2016/5/11/chartex" xmlns:cx6="http://schemas.microsoft.com/office/drawing/2016/5/12/chartex" xmlns:cx7="http://schemas.microsoft.com/office/drawing/2016/5/13/chartex" xmlns:cx8="http://schemas.microsoft.com/office/drawing/2016/5/14/chartex" xmlns:mc="http://schemas.openxmlformats.org/markup-compatibility/2006" xmlns:aink="http://schemas.microsoft.com/office/drawing/2016/ink" xmlns:am3d="http://schemas.microsoft.com/office/drawing/2017/model3d" xmlns:o="urn:schemas-microsoft-com:office:office" xmlns:oel="http://schemas.microsoft.com/office/2019/extlst" xmlns:r="http://schemas.openxmlformats.org/officeDocument/2006/relationships" xmlns:m="http://schemas.openxmlformats.org/officeDocument/2006/math" xmlns:v="urn:schemas-microsoft-com:vml" xmlns:wp14="http://schemas.microsoft.com/office/word/2010/wordprocessingDrawing" xmlns:wp="http://schemas.openxmlformats.org/drawingml/2006/wordprocessingDrawing" xmlns:w10="urn:schemas-microsoft-com:office:word" xmlns:w="http://schemas.openxmlformats.org/wordprocessingml/2006/main" xmlns:w14="http://schemas.microsoft.com/office/word/2010/wordml" xmlns:w15="http://schemas.microsoft.com/office/word/2012/wordml" xmlns:w16cex="http://schemas.microsoft.com/office/word/2018/wordml/cex" xmlns:w16cid="http://schemas.microsoft.com/office/word/2016/wordml/cid" xmlns:w16="http://schemas.microsoft.com/office/word/2018/wordml" xmlns:w16du="http://schemas.microsoft.com/office/word/2023/wordml/word16du" xmlns:w16sdtdh="http://schemas.microsoft.com/office/word/2020/wordml/sdtdatahash" xmlns:w16sdtfl="http://schemas.microsoft.com/office/word/2024/wordml/sdtformatlock" xmlns:w16se="http://schemas.microsoft.com/office/word/2015/wordml/symex" xmlns:wpg="http://schemas.microsoft.com/office/word/2010/wordprocessingGroup" xmlns:wpi="http://schemas.microsoft.com/office/word/2010/wordprocessingInk" xmlns:wne="http://schemas.microsoft.com/office/word/2006/wordml" xmlns:wps="http://schemas.microsoft.com/office/word/2010/wordprocessingShape" mc:Ignorable="w14 w15 w16se w16cid w16 w16cex w16sdtdh w16sdtfl w16du wp14">
+<w:ftr xmlns:wpc="http://schemas.microsoft.com/office/word/2010/wordprocessingCanvas" xmlns:cx="http://schemas.microsoft.com/office/drawing/2014/chartex" xmlns:cx1="http://schemas.microsoft.com/office/drawing/2015/9/8/chartex" xmlns:cx2="http://schemas.microsoft.com/office/drawing/2015/10/21/chartex" xmlns:cx3="http://schemas.microsoft.com/office/drawing/2016/5/9/chartex" xmlns:cx4="http://schemas.microsoft.com/office/drawing/2016/5/10/chartex" xmlns:cx5="http://schemas.microsoft.com/office/drawing/2016/5/11/chartex" xmlns:cx6="http://schemas.microsoft.com/office/drawing/2016/5/12/chartex" xmlns:cx7="http://schemas.microsoft.com/office/drawing/2016/5/13/chartex" xmlns:cx8="http://schemas.microsoft.com/office/drawing/2016/5/14/chartex" xmlns:mc="http://schemas.openxmlformats.org/markup-compatibility/2006" xmlns:aink="http://schemas.microsoft.com/office/drawing/2016/ink" xmlns:am3d="http://schemas.microsoft.com/office/drawing/2017/model3d" xmlns:o="urn:schemas-microsoft-com:office:office" xmlns:oel="http://schemas.microsoft.com/office/2019/extlst" xmlns:r="http://schemas.openxmlformats.org/officeDocument/2006/relationships" xmlns:m="http://schemas.openxmlformats.org/officeDocument/2006/math" xmlns:v="urn:schemas-microsoft-com:vml" xmlns:wp14="http://schemas.microsoft.com/office/word/2010/wordprocessingDrawing" xmlns:wp="http://schemas.openxmlformats.org/drawingml/2006/wordprocessingDrawing" xmlns:w10="urn:schemas-microsoft-com:office:word" xmlns:w="http://schemas.openxmlformats.org/wordprocessingml/2006/main" xmlns:w14="http://schemas.microsoft.com/office/word/2010/wordml" xmlns:w15="http://schemas.microsoft.com/office/word/2012/wordml" xmlns:w16cei="http://schemas.microsoft.com/office/word/2026/wordml/cei" xmlns:w16cex="http://schemas.microsoft.com/office/word/2018/wordml/cex" xmlns:w16cid="http://schemas.microsoft.com/office/word/2016/wordml/cid" xmlns:w16="http://schemas.microsoft.com/office/word/2018/wordml" xmlns:w16du="http://schemas.microsoft.com/office/word/2023/wordml/word16du" xmlns:w16sdtdh="http://schemas.microsoft.com/office/word/2020/wordml/sdtdatahash" xmlns:w16sdtfl="http://schemas.microsoft.com/office/word/2024/wordml/sdtformatlock" xmlns:w16se="http://schemas.microsoft.com/office/word/2015/wordml/symex" xmlns:wpg="http://schemas.microsoft.com/office/word/2010/wordprocessingGroup" xmlns:wpi="http://schemas.microsoft.com/office/word/2010/wordprocessingInk" xmlns:wne="http://schemas.microsoft.com/office/word/2006/wordml" xmlns:wps="http://schemas.microsoft.com/office/word/2010/wordprocessingShape" mc:Ignorable="w14 w15 w16se w16cid w16 w16cex w16sdtdh w16sdtfl w16du wp14">
   <w:p>
     <w:pPr>
       <w:pBdr>
@@ -42787,7 +42688,7 @@
 </file>
 
 <file path=word/footnotes.xml><?xml version="1.0" encoding="utf-8"?>
-<w:footnotes xmlns:wpc="http://schemas.microsoft.com/office/word/2010/wordprocessingCanvas" xmlns:cx="http://schemas.microsoft.com/office/drawing/2014/chartex" xmlns:cx1="http://schemas.microsoft.com/office/drawing/2015/9/8/chartex" xmlns:cx2="http://schemas.microsoft.com/office/drawing/2015/10/21/chartex" xmlns:cx3="http://schemas.microsoft.com/office/drawing/2016/5/9/chartex" xmlns:cx4="http://schemas.microsoft.com/office/drawing/2016/5/10/chartex" xmlns:cx5="http://schemas.microsoft.com/office/drawing/2016/5/11/chartex" xmlns:cx6="http://schemas.microsoft.com/office/drawing/2016/5/12/chartex" xmlns:cx7="http://schemas.microsoft.com/office/drawing/2016/5/13/chartex" xmlns:cx8="http://schemas.microsoft.com/office/drawing/2016/5/14/chartex" xmlns:mc="http://schemas.openxmlformats.org/markup-compatibility/2006" xmlns:aink="http://schemas.microsoft.com/office/drawing/2016/ink" xmlns:am3d="http://schemas.microsoft.com/office/drawing/2017/model3d" xmlns:o="urn:schemas-microsoft-com:office:office" xmlns:oel="http://schemas.microsoft.com/office/2019/extlst" xmlns:r="http://schemas.openxmlformats.org/officeDocument/2006/relationships" xmlns:m="http://schemas.openxmlformats.org/officeDocument/2006/math" xmlns:v="urn:schemas-microsoft-com:vml" xmlns:wp14="http://schemas.microsoft.com/office/word/2010/wordprocessingDrawing" xmlns:wp="http://schemas.openxmlformats.org/drawingml/2006/wordprocessingDrawing" xmlns:w10="urn:schemas-microsoft-com:office:word" xmlns:w="http://schemas.openxmlformats.org/wordprocessingml/2006/main" xmlns:w14="http://schemas.microsoft.com/office/word/2010/wordml" xmlns:w15="http://schemas.microsoft.com/office/word/2012/wordml" xmlns:w16cex="http://schemas.microsoft.com/office/word/2018/wordml/cex" xmlns:w16cid="http://schemas.microsoft.com/office/word/2016/wordml/cid" xmlns:w16="http://schemas.microsoft.com/office/word/2018/wordml" xmlns:w16du="http://schemas.microsoft.com/office/word/2023/wordml/word16du" xmlns:w16sdtdh="http://schemas.microsoft.com/office/word/2020/wordml/sdtdatahash" xmlns:w16sdtfl="http://schemas.microsoft.com/office/word/2024/wordml/sdtformatlock" xmlns:w16se="http://schemas.microsoft.com/office/word/2015/wordml/symex" xmlns:wpg="http://schemas.microsoft.com/office/word/2010/wordprocessingGroup" xmlns:wpi="http://schemas.microsoft.com/office/word/2010/wordprocessingInk" xmlns:wne="http://schemas.microsoft.com/office/word/2006/wordml" xmlns:wps="http://schemas.microsoft.com/office/word/2010/wordprocessingShape" mc:Ignorable="w14 w15 w16se w16cid w16 w16cex w16sdtdh w16sdtfl w16du wp14">
+<w:footnotes xmlns:wpc="http://schemas.microsoft.com/office/word/2010/wordprocessingCanvas" xmlns:cx="http://schemas.microsoft.com/office/drawing/2014/chartex" xmlns:cx1="http://schemas.microsoft.com/office/drawing/2015/9/8/chartex" xmlns:cx2="http://schemas.microsoft.com/office/drawing/2015/10/21/chartex" xmlns:cx3="http://schemas.microsoft.com/office/drawing/2016/5/9/chartex" xmlns:cx4="http://schemas.microsoft.com/office/drawing/2016/5/10/chartex" xmlns:cx5="http://schemas.microsoft.com/office/drawing/2016/5/11/chartex" xmlns:cx6="http://schemas.microsoft.com/office/drawing/2016/5/12/chartex" xmlns:cx7="http://schemas.microsoft.com/office/drawing/2016/5/13/chartex" xmlns:cx8="http://schemas.microsoft.com/office/drawing/2016/5/14/chartex" xmlns:mc="http://schemas.openxmlformats.org/markup-compatibility/2006" xmlns:aink="http://schemas.microsoft.com/office/drawing/2016/ink" xmlns:am3d="http://schemas.microsoft.com/office/drawing/2017/model3d" xmlns:o="urn:schemas-microsoft-com:office:office" xmlns:oel="http://schemas.microsoft.com/office/2019/extlst" xmlns:r="http://schemas.openxmlformats.org/officeDocument/2006/relationships" xmlns:m="http://schemas.openxmlformats.org/officeDocument/2006/math" xmlns:v="urn:schemas-microsoft-com:vml" xmlns:wp14="http://schemas.microsoft.com/office/word/2010/wordprocessingDrawing" xmlns:wp="http://schemas.openxmlformats.org/drawingml/2006/wordprocessingDrawing" xmlns:w10="urn:schemas-microsoft-com:office:word" xmlns:w="http://schemas.openxmlformats.org/wordprocessingml/2006/main" xmlns:w14="http://schemas.microsoft.com/office/word/2010/wordml" xmlns:w15="http://schemas.microsoft.com/office/word/2012/wordml" xmlns:w16cei="http://schemas.microsoft.com/office/word/2026/wordml/cei" xmlns:w16cex="http://schemas.microsoft.com/office/word/2018/wordml/cex" xmlns:w16cid="http://schemas.microsoft.com/office/word/2016/wordml/cid" xmlns:w16="http://schemas.microsoft.com/office/word/2018/wordml" xmlns:w16du="http://schemas.microsoft.com/office/word/2023/wordml/word16du" xmlns:w16sdtdh="http://schemas.microsoft.com/office/word/2020/wordml/sdtdatahash" xmlns:w16sdtfl="http://schemas.microsoft.com/office/word/2024/wordml/sdtformatlock" xmlns:w16se="http://schemas.microsoft.com/office/word/2015/wordml/symex" xmlns:wpg="http://schemas.microsoft.com/office/word/2010/wordprocessingGroup" xmlns:wpi="http://schemas.microsoft.com/office/word/2010/wordprocessingInk" xmlns:wne="http://schemas.microsoft.com/office/word/2006/wordml" xmlns:wps="http://schemas.microsoft.com/office/word/2010/wordprocessingShape" mc:Ignorable="w14 w15 w16se w16cid w16 w16cex w16sdtdh w16sdtfl w16du wp14">
   <w:footnote w:type="separator" w:id="-1">
     <w:p>
       <w:pPr>
@@ -42812,7 +42713,7 @@
 </file>
 
 <file path=word/header1.xml><?xml version="1.0" encoding="utf-8"?>
-<w:hdr xmlns:wpc="http://schemas.microsoft.com/office/word/2010/wordprocessingCanvas" xmlns:cx="http://schemas.microsoft.com/office/drawing/2014/chartex" xmlns:cx1="http://schemas.microsoft.com/office/drawing/2015/9/8/chartex" xmlns:cx2="http://schemas.microsoft.com/office/drawing/2015/10/21/chartex" xmlns:cx3="http://schemas.microsoft.com/office/drawing/2016/5/9/chartex" xmlns:cx4="http://schemas.microsoft.com/office/drawing/2016/5/10/chartex" xmlns:cx5="http://schemas.microsoft.com/office/drawing/2016/5/11/chartex" xmlns:cx6="http://schemas.microsoft.com/office/drawing/2016/5/12/chartex" xmlns:cx7="http://schemas.microsoft.com/office/drawing/2016/5/13/chartex" xmlns:cx8="http://schemas.microsoft.com/office/drawing/2016/5/14/chartex" xmlns:mc="http://schemas.openxmlformats.org/markup-compatibility/2006" xmlns:aink="http://schemas.microsoft.com/office/drawing/2016/ink" xmlns:am3d="http://schemas.microsoft.com/office/drawing/2017/model3d" xmlns:o="urn:schemas-microsoft-com:office:office" xmlns:oel="http://schemas.microsoft.com/office/2019/extlst" xmlns:r="http://schemas.openxmlformats.org/officeDocument/2006/relationships" xmlns:m="http://schemas.openxmlformats.org/officeDocument/2006/math" xmlns:v="urn:schemas-microsoft-com:vml" xmlns:wp14="http://schemas.microsoft.com/office/word/2010/wordprocessingDrawing" xmlns:wp="http://schemas.openxmlformats.org/drawingml/2006/wordprocessingDrawing" xmlns:w10="urn:schemas-microsoft-com:office:word" xmlns:w="http://schemas.openxmlformats.org/wordprocessingml/2006/main" xmlns:w14="http://schemas.microsoft.com/office/word/2010/wordml" xmlns:w15="http://schemas.microsoft.com/office/word/2012/wordml" xmlns:w16cex="http://schemas.microsoft.com/office/word/2018/wordml/cex" xmlns:w16cid="http://schemas.microsoft.com/office/word/2016/wordml/cid" xmlns:w16="http://schemas.microsoft.com/office/word/2018/wordml" xmlns:w16du="http://schemas.microsoft.com/office/word/2023/wordml/word16du" xmlns:w16sdtdh="http://schemas.microsoft.com/office/word/2020/wordml/sdtdatahash" xmlns:w16sdtfl="http://schemas.microsoft.com/office/word/2024/wordml/sdtformatlock" xmlns:w16se="http://schemas.microsoft.com/office/word/2015/wordml/symex" xmlns:wpg="http://schemas.microsoft.com/office/word/2010/wordprocessingGroup" xmlns:wpi="http://schemas.microsoft.com/office/word/2010/wordprocessingInk" xmlns:wne="http://schemas.microsoft.com/office/word/2006/wordml" xmlns:wps="http://schemas.microsoft.com/office/word/2010/wordprocessingShape" mc:Ignorable="w14 w15 w16se w16cid w16 w16cex w16sdtdh w16sdtfl w16du wp14">
+<w:hdr xmlns:wpc="http://schemas.microsoft.com/office/word/2010/wordprocessingCanvas" xmlns:cx="http://schemas.microsoft.com/office/drawing/2014/chartex" xmlns:cx1="http://schemas.microsoft.com/office/drawing/2015/9/8/chartex" xmlns:cx2="http://schemas.microsoft.com/office/drawing/2015/10/21/chartex" xmlns:cx3="http://schemas.microsoft.com/office/drawing/2016/5/9/chartex" xmlns:cx4="http://schemas.microsoft.com/office/drawing/2016/5/10/chartex" xmlns:cx5="http://schemas.microsoft.com/office/drawing/2016/5/11/chartex" xmlns:cx6="http://schemas.microsoft.com/office/drawing/2016/5/12/chartex" xmlns:cx7="http://schemas.microsoft.com/office/drawing/2016/5/13/chartex" xmlns:cx8="http://schemas.microsoft.com/office/drawing/2016/5/14/chartex" xmlns:mc="http://schemas.openxmlformats.org/markup-compatibility/2006" xmlns:aink="http://schemas.microsoft.com/office/drawing/2016/ink" xmlns:am3d="http://schemas.microsoft.com/office/drawing/2017/model3d" xmlns:o="urn:schemas-microsoft-com:office:office" xmlns:oel="http://schemas.microsoft.com/office/2019/extlst" xmlns:r="http://schemas.openxmlformats.org/officeDocument/2006/relationships" xmlns:m="http://schemas.openxmlformats.org/officeDocument/2006/math" xmlns:v="urn:schemas-microsoft-com:vml" xmlns:wp14="http://schemas.microsoft.com/office/word/2010/wordprocessingDrawing" xmlns:wp="http://schemas.openxmlformats.org/drawingml/2006/wordprocessingDrawing" xmlns:w10="urn:schemas-microsoft-com:office:word" xmlns:w="http://schemas.openxmlformats.org/wordprocessingml/2006/main" xmlns:w14="http://schemas.microsoft.com/office/word/2010/wordml" xmlns:w15="http://schemas.microsoft.com/office/word/2012/wordml" xmlns:w16cei="http://schemas.microsoft.com/office/word/2026/wordml/cei" xmlns:w16cex="http://schemas.microsoft.com/office/word/2018/wordml/cex" xmlns:w16cid="http://schemas.microsoft.com/office/word/2016/wordml/cid" xmlns:w16="http://schemas.microsoft.com/office/word/2018/wordml" xmlns:w16du="http://schemas.microsoft.com/office/word/2023/wordml/word16du" xmlns:w16sdtdh="http://schemas.microsoft.com/office/word/2020/wordml/sdtdatahash" xmlns:w16sdtfl="http://schemas.microsoft.com/office/word/2024/wordml/sdtformatlock" xmlns:w16se="http://schemas.microsoft.com/office/word/2015/wordml/symex" xmlns:wpg="http://schemas.microsoft.com/office/word/2010/wordprocessingGroup" xmlns:wpi="http://schemas.microsoft.com/office/word/2010/wordprocessingInk" xmlns:wne="http://schemas.microsoft.com/office/word/2006/wordml" xmlns:wps="http://schemas.microsoft.com/office/word/2010/wordprocessingShape" mc:Ignorable="w14 w15 w16se w16cid w16 w16cex w16sdtdh w16sdtfl w16du wp14">
   <w:p>
     <w:pPr>
       <w:pStyle w:val="Header"/>
@@ -42833,7 +42734,7 @@
 </file>
 
 <file path=word/header2.xml><?xml version="1.0" encoding="utf-8"?>
-<w:hdr xmlns:wpc="http://schemas.microsoft.com/office/word/2010/wordprocessingCanvas" xmlns:cx="http://schemas.microsoft.com/office/drawing/2014/chartex" xmlns:cx1="http://schemas.microsoft.com/office/drawing/2015/9/8/chartex" xmlns:cx2="http://schemas.microsoft.com/office/drawing/2015/10/21/chartex" xmlns:cx3="http://schemas.microsoft.com/office/drawing/2016/5/9/chartex" xmlns:cx4="http://schemas.microsoft.com/office/drawing/2016/5/10/chartex" xmlns:cx5="http://schemas.microsoft.com/office/drawing/2016/5/11/chartex" xmlns:cx6="http://schemas.microsoft.com/office/drawing/2016/5/12/chartex" xmlns:cx7="http://schemas.microsoft.com/office/drawing/2016/5/13/chartex" xmlns:cx8="http://schemas.microsoft.com/office/drawing/2016/5/14/chartex" xmlns:mc="http://schemas.openxmlformats.org/markup-compatibility/2006" xmlns:aink="http://schemas.microsoft.com/office/drawing/2016/ink" xmlns:am3d="http://schemas.microsoft.com/office/drawing/2017/model3d" xmlns:o="urn:schemas-microsoft-com:office:office" xmlns:oel="http://schemas.microsoft.com/office/2019/extlst" xmlns:r="http://schemas.openxmlformats.org/officeDocument/2006/relationships" xmlns:m="http://schemas.openxmlformats.org/officeDocument/2006/math" xmlns:v="urn:schemas-microsoft-com:vml" xmlns:wp14="http://schemas.microsoft.com/office/word/2010/wordprocessingDrawing" xmlns:wp="http://schemas.openxmlformats.org/drawingml/2006/wordprocessingDrawing" xmlns:w10="urn:schemas-microsoft-com:office:word" xmlns:w="http://schemas.openxmlformats.org/wordprocessingml/2006/main" xmlns:w14="http://schemas.microsoft.com/office/word/2010/wordml" xmlns:w15="http://schemas.microsoft.com/office/word/2012/wordml" xmlns:w16cex="http://schemas.microsoft.com/office/word/2018/wordml/cex" xmlns:w16cid="http://schemas.microsoft.com/office/word/2016/wordml/cid" xmlns:w16="http://schemas.microsoft.com/office/word/2018/wordml" xmlns:w16du="http://schemas.microsoft.com/office/word/2023/wordml/word16du" xmlns:w16sdtdh="http://schemas.microsoft.com/office/word/2020/wordml/sdtdatahash" xmlns:w16sdtfl="http://schemas.microsoft.com/office/word/2024/wordml/sdtformatlock" xmlns:w16se="http://schemas.microsoft.com/office/word/2015/wordml/symex" xmlns:wpg="http://schemas.microsoft.com/office/word/2010/wordprocessingGroup" xmlns:wpi="http://schemas.microsoft.com/office/word/2010/wordprocessingInk" xmlns:wne="http://schemas.microsoft.com/office/word/2006/wordml" xmlns:wps="http://schemas.microsoft.com/office/word/2010/wordprocessingShape" mc:Ignorable="w14 w15 w16se w16cid w16 w16cex w16sdtdh w16sdtfl w16du wp14">
+<w:hdr xmlns:wpc="http://schemas.microsoft.com/office/word/2010/wordprocessingCanvas" xmlns:cx="http://schemas.microsoft.com/office/drawing/2014/chartex" xmlns:cx1="http://schemas.microsoft.com/office/drawing/2015/9/8/chartex" xmlns:cx2="http://schemas.microsoft.com/office/drawing/2015/10/21/chartex" xmlns:cx3="http://schemas.microsoft.com/office/drawing/2016/5/9/chartex" xmlns:cx4="http://schemas.microsoft.com/office/drawing/2016/5/10/chartex" xmlns:cx5="http://schemas.microsoft.com/office/drawing/2016/5/11/chartex" xmlns:cx6="http://schemas.microsoft.com/office/drawing/2016/5/12/chartex" xmlns:cx7="http://schemas.microsoft.com/office/drawing/2016/5/13/chartex" xmlns:cx8="http://schemas.microsoft.com/office/drawing/2016/5/14/chartex" xmlns:mc="http://schemas.openxmlformats.org/markup-compatibility/2006" xmlns:aink="http://schemas.microsoft.com/office/drawing/2016/ink" xmlns:am3d="http://schemas.microsoft.com/office/drawing/2017/model3d" xmlns:o="urn:schemas-microsoft-com:office:office" xmlns:oel="http://schemas.microsoft.com/office/2019/extlst" xmlns:r="http://schemas.openxmlformats.org/officeDocument/2006/relationships" xmlns:m="http://schemas.openxmlformats.org/officeDocument/2006/math" xmlns:v="urn:schemas-microsoft-com:vml" xmlns:wp14="http://schemas.microsoft.com/office/word/2010/wordprocessingDrawing" xmlns:wp="http://schemas.openxmlformats.org/drawingml/2006/wordprocessingDrawing" xmlns:w10="urn:schemas-microsoft-com:office:word" xmlns:w="http://schemas.openxmlformats.org/wordprocessingml/2006/main" xmlns:w14="http://schemas.microsoft.com/office/word/2010/wordml" xmlns:w15="http://schemas.microsoft.com/office/word/2012/wordml" xmlns:w16cei="http://schemas.microsoft.com/office/word/2026/wordml/cei" xmlns:w16cex="http://schemas.microsoft.com/office/word/2018/wordml/cex" xmlns:w16cid="http://schemas.microsoft.com/office/word/2016/wordml/cid" xmlns:w16="http://schemas.microsoft.com/office/word/2018/wordml" xmlns:w16du="http://schemas.microsoft.com/office/word/2023/wordml/word16du" xmlns:w16sdtdh="http://schemas.microsoft.com/office/word/2020/wordml/sdtdatahash" xmlns:w16sdtfl="http://schemas.microsoft.com/office/word/2024/wordml/sdtformatlock" xmlns:w16se="http://schemas.microsoft.com/office/word/2015/wordml/symex" xmlns:wpg="http://schemas.microsoft.com/office/word/2010/wordprocessingGroup" xmlns:wpi="http://schemas.microsoft.com/office/word/2010/wordprocessingInk" xmlns:wne="http://schemas.microsoft.com/office/word/2006/wordml" xmlns:wps="http://schemas.microsoft.com/office/word/2010/wordprocessingShape" mc:Ignorable="w14 w15 w16se w16cid w16 w16cex w16sdtdh w16sdtfl w16du wp14">
   <w:p>
     <w:pPr>
       <w:pStyle w:val="Header"/>

</xml_diff>